<commit_message>
NdO methods: Fig. 3h from our QE gaps (user), no result values in Methods (user), NdP5O14 named
- Fig. 3h paragraph now describes the August SEI QE chain (MP structures ->
  vc-relax -> SCF -> fixed-occupation nscf; GBRV Li/S/Cl + PSlibrary P/O); Fig. SX
  paragraph = same procedure with all-PAW PSlibrary and frozen-4f Nd, NdP5O14 named
- SI drops four result values (Li3Nd E_hull, endpoint 1.4 eV, mu_Li0, LiCl E_hull)
- Origin-ready CSV for the new Fig. 3h bars (db/properties/ndo_fig3h_sei_gaps_qe_origin.csv)
- md checklist/provenance/evidence tables and open_items updated

Co-Authored-By: Claude Opus 5.5 <noreply@anthropic.com>
Claude-Session: https://claude.ai/code/session_01QtbBQvJTvwH5CtkzA6CTzs
</commit_message>
<xml_diff>
--- a/kb/papers/ndo_lpscl16_methods_SI_2026_10_28.docx
+++ b/kb/papers/ndo_lpscl16_methods_SI_2026_10_28.docx
@@ -127,16 +127,7 @@
         <w:t xml:space="preserve">m</w:t>
       </w:r>
       <w:r>
-        <w:t xml:space="preserve">; mp-976264, a hypothetical phase 0.197 eV atom</w:t>
-      </w:r>
-      <w:r>
-        <w:rPr>
-          <w:vertAlign w:val="superscript"/>
-        </w:rPr>
-        <w:t xml:space="preserve">−1</w:t>
-      </w:r>
-      <w:r>
-        <w:t xml:space="preserve"> above the convex hull) were first relaxed with variable cell. Ultrasoft pseudopotentials from the GBRV library (v1.4) were used for Li and S [8], and the PAW dataset Nd.pbe-spdn-kjpaw</w:t>
+        <w:t xml:space="preserve">; mp-976264, a hypothetical phase above the convex hull) were first relaxed with variable cell. Ultrasoft pseudopotentials from the GBRV library (v1.4) were used for Li and S [8], and the PAW dataset Nd.pbe-spdn-kjpaw</w:t>
       </w:r>
       <w:r>
         <w:t xml:space="preserve">_</w:t>
@@ -259,7 +250,7 @@
         <w:t xml:space="preserve">3</w:t>
       </w:r>
       <w:r>
-        <w:t xml:space="preserve">Nd, relaxation of both vacancy endpoints from the ideal lattice lowered the energy by about 1.4 eV per supercell, so the barrier refers to this locally reconstructed 2 × 2 × 2 model. A larger-cell check was not possible, because the 3 × 3 × 3 CI-NEB did not converge and the 3 × 3 × 3 cells reconstructed substantially on relaxation; the Li</w:t>
+        <w:t xml:space="preserve">Nd, both vacancy endpoints reconstructed substantially on relaxation from the ideal lattice, so the barrier refers to this locally reconstructed 2 × 2 × 2 model. A larger-cell check was not possible, because the 3 × 3 × 3 CI-NEB did not converge and the 3 × 3 × 3 cells reconstructed substantially on relaxation; the Li</w:t>
       </w:r>
       <w:r>
         <w:rPr>
@@ -287,172 +278,182 @@
         <w:jc w:val="both"/>
       </w:pPr>
       <w:r>
-        <w:t xml:space="preserve">The band gaps of the SEI components in Fig. 3h were taken from the Materials Project database [7] (summary band gaps, queried with the mp</w:t>
+        <w:t xml:space="preserve">The band gaps of the interphase components in Fig. 3h were calculated for Li</w:t>
+      </w:r>
+      <w:r>
+        <w:rPr>
+          <w:vertAlign w:val="subscript"/>
+        </w:rPr>
+        <w:t xml:space="preserve">2</w:t>
+      </w:r>
+      <w:r>
+        <w:t xml:space="preserve">S (mp-1153, </w:t>
+      </w:r>
+      <w:r>
+        <w:rPr>
+          <w:i/>
+          <w:iCs/>
+        </w:rPr>
+        <w:t xml:space="preserve">Fm</w:t>
+      </w:r>
+      <w:r>
+        <w:t xml:space="preserve">3̅</w:t>
+      </w:r>
+      <w:r>
+        <w:rPr>
+          <w:i/>
+          <w:iCs/>
+        </w:rPr>
+        <w:t xml:space="preserve">m</w:t>
+      </w:r>
+      <w:r>
+        <w:t xml:space="preserve">), Li</w:t>
+      </w:r>
+      <w:r>
+        <w:rPr>
+          <w:vertAlign w:val="subscript"/>
+        </w:rPr>
+        <w:t xml:space="preserve">3</w:t>
+      </w:r>
+      <w:r>
+        <w:t xml:space="preserve">P (mp-736, </w:t>
+      </w:r>
+      <w:r>
+        <w:rPr>
+          <w:i/>
+          <w:iCs/>
+        </w:rPr>
+        <w:t xml:space="preserve">P</w:t>
+      </w:r>
+      <w:r>
+        <w:t xml:space="preserve">6</w:t>
+      </w:r>
+      <w:r>
+        <w:rPr>
+          <w:vertAlign w:val="subscript"/>
+        </w:rPr>
+        <w:t xml:space="preserve">3</w:t>
+      </w:r>
+      <w:r>
+        <w:t xml:space="preserve">/</w:t>
+      </w:r>
+      <w:r>
+        <w:rPr>
+          <w:i/>
+          <w:iCs/>
+        </w:rPr>
+        <w:t xml:space="preserve">mmc</w:t>
+      </w:r>
+      <w:r>
+        <w:t xml:space="preserve">), Li</w:t>
+      </w:r>
+      <w:r>
+        <w:rPr>
+          <w:vertAlign w:val="subscript"/>
+        </w:rPr>
+        <w:t xml:space="preserve">2</w:t>
+      </w:r>
+      <w:r>
+        <w:t xml:space="preserve">O (mp-1960, </w:t>
+      </w:r>
+      <w:r>
+        <w:rPr>
+          <w:i/>
+          <w:iCs/>
+        </w:rPr>
+        <w:t xml:space="preserve">Fm</w:t>
+      </w:r>
+      <w:r>
+        <w:t xml:space="preserve">3̅</w:t>
+      </w:r>
+      <w:r>
+        <w:rPr>
+          <w:i/>
+          <w:iCs/>
+        </w:rPr>
+        <w:t xml:space="preserve">m</w:t>
+      </w:r>
+      <w:r>
+        <w:t xml:space="preserve">), β-Li</w:t>
+      </w:r>
+      <w:r>
+        <w:rPr>
+          <w:vertAlign w:val="subscript"/>
+        </w:rPr>
+        <w:t xml:space="preserve">3</w:t>
+      </w:r>
+      <w:r>
+        <w:t xml:space="preserve">PO</w:t>
+      </w:r>
+      <w:r>
+        <w:rPr>
+          <w:vertAlign w:val="subscript"/>
+        </w:rPr>
+        <w:t xml:space="preserve">4</w:t>
+      </w:r>
+      <w:r>
+        <w:t xml:space="preserve"> (mp-13725, </w:t>
+      </w:r>
+      <w:r>
+        <w:rPr>
+          <w:i/>
+          <w:iCs/>
+        </w:rPr>
+        <w:t xml:space="preserve">Pmn</w:t>
+      </w:r>
+      <w:r>
+        <w:t xml:space="preserve">2</w:t>
+      </w:r>
+      <w:r>
+        <w:rPr>
+          <w:vertAlign w:val="subscript"/>
+        </w:rPr>
+        <w:t xml:space="preserve">1</w:t>
+      </w:r>
+      <w:r>
+        <w:t xml:space="preserve">), and rock-salt LiCl (mp-22905, </w:t>
+      </w:r>
+      <w:r>
+        <w:rPr>
+          <w:i/>
+          <w:iCs/>
+        </w:rPr>
+        <w:t xml:space="preserve">Fm</w:t>
+      </w:r>
+      <w:r>
+        <w:t xml:space="preserve">3̅</w:t>
+      </w:r>
+      <w:r>
+        <w:rPr>
+          <w:i/>
+          <w:iCs/>
+        </w:rPr>
+        <w:t xml:space="preserve">m</w:t>
+      </w:r>
+      <w:r>
+        <w:t xml:space="preserve">), whose structures were taken from the Materials Project database [7]. Ultrasoft GBRV pseudopotentials (v1.4) were used for Li, S, and Cl [8], and PSlibrary datasets were used for P (ultrasoft, P.pbe-n-rrkjus</w:t>
       </w:r>
       <w:r>
         <w:t xml:space="preserve">_</w:t>
       </w:r>
       <w:r>
-        <w:t xml:space="preserve">api client in September 2026). For each compound, the entry with the lowest energy above the convex hull was used: Li</w:t>
-      </w:r>
-      <w:r>
-        <w:rPr>
-          <w:vertAlign w:val="subscript"/>
-        </w:rPr>
-        <w:t xml:space="preserve">2</w:t>
-      </w:r>
-      <w:r>
-        <w:t xml:space="preserve">S (mp-1153, </w:t>
-      </w:r>
-      <w:r>
-        <w:rPr>
-          <w:i/>
-          <w:iCs/>
-        </w:rPr>
-        <w:t xml:space="preserve">Fm</w:t>
-      </w:r>
-      <w:r>
-        <w:t xml:space="preserve">3̅</w:t>
-      </w:r>
-      <w:r>
-        <w:rPr>
-          <w:i/>
-          <w:iCs/>
-        </w:rPr>
-        <w:t xml:space="preserve">m</w:t>
-      </w:r>
-      <w:r>
-        <w:t xml:space="preserve">), Li</w:t>
-      </w:r>
-      <w:r>
-        <w:rPr>
-          <w:vertAlign w:val="subscript"/>
-        </w:rPr>
-        <w:t xml:space="preserve">3</w:t>
-      </w:r>
-      <w:r>
-        <w:t xml:space="preserve">P (mp-736, </w:t>
-      </w:r>
-      <w:r>
-        <w:rPr>
-          <w:i/>
-          <w:iCs/>
-        </w:rPr>
-        <w:t xml:space="preserve">P</w:t>
-      </w:r>
-      <w:r>
-        <w:t xml:space="preserve">6</w:t>
-      </w:r>
-      <w:r>
-        <w:rPr>
-          <w:vertAlign w:val="subscript"/>
-        </w:rPr>
-        <w:t xml:space="preserve">3</w:t>
-      </w:r>
-      <w:r>
-        <w:t xml:space="preserve">/</w:t>
-      </w:r>
-      <w:r>
-        <w:rPr>
-          <w:i/>
-          <w:iCs/>
-        </w:rPr>
-        <w:t xml:space="preserve">mmc</w:t>
-      </w:r>
-      <w:r>
-        <w:t xml:space="preserve">), Li</w:t>
-      </w:r>
-      <w:r>
-        <w:rPr>
-          <w:vertAlign w:val="subscript"/>
-        </w:rPr>
-        <w:t xml:space="preserve">2</w:t>
-      </w:r>
-      <w:r>
-        <w:t xml:space="preserve">O (mp-1960, </w:t>
-      </w:r>
-      <w:r>
-        <w:rPr>
-          <w:i/>
-          <w:iCs/>
-        </w:rPr>
-        <w:t xml:space="preserve">Fm</w:t>
-      </w:r>
-      <w:r>
-        <w:t xml:space="preserve">3̅</w:t>
-      </w:r>
-      <w:r>
-        <w:rPr>
-          <w:i/>
-          <w:iCs/>
-        </w:rPr>
-        <w:t xml:space="preserve">m</w:t>
-      </w:r>
-      <w:r>
-        <w:t xml:space="preserve">), Li</w:t>
-      </w:r>
-      <w:r>
-        <w:rPr>
-          <w:vertAlign w:val="subscript"/>
-        </w:rPr>
-        <w:t xml:space="preserve">3</w:t>
-      </w:r>
-      <w:r>
-        <w:t xml:space="preserve">PO</w:t>
-      </w:r>
-      <w:r>
-        <w:rPr>
-          <w:vertAlign w:val="subscript"/>
-        </w:rPr>
-        <w:t xml:space="preserve">4</w:t>
-      </w:r>
-      <w:r>
-        <w:t xml:space="preserve"> (mp-13725, </w:t>
-      </w:r>
-      <w:r>
-        <w:rPr>
-          <w:i/>
-          <w:iCs/>
-        </w:rPr>
-        <w:t xml:space="preserve">Pmn</w:t>
-      </w:r>
-      <w:r>
-        <w:t xml:space="preserve">2</w:t>
-      </w:r>
-      <w:r>
-        <w:rPr>
-          <w:vertAlign w:val="subscript"/>
-        </w:rPr>
-        <w:t xml:space="preserve">1</w:t>
-      </w:r>
-      <w:r>
-        <w:t xml:space="preserve">), and LiCl (mp-1185319, </w:t>
-      </w:r>
-      <w:r>
-        <w:rPr>
-          <w:i/>
-          <w:iCs/>
-        </w:rPr>
-        <w:t xml:space="preserve">P</w:t>
-      </w:r>
-      <w:r>
-        <w:t xml:space="preserve">6</w:t>
-      </w:r>
-      <w:r>
-        <w:rPr>
-          <w:vertAlign w:val="subscript"/>
-        </w:rPr>
-        <w:t xml:space="preserve">3</w:t>
-      </w:r>
-      <w:r>
-        <w:rPr>
-          <w:i/>
-          <w:iCs/>
-        </w:rPr>
-        <w:t xml:space="preserve">mc</w:t>
-      </w:r>
-      <w:r>
-        <w:t xml:space="preserve">; 0.004 eV atom</w:t>
+        <w:t xml:space="preserve">psl.1.0.0) and O (PAW, O.pbe-n-kjpaw</w:t>
+      </w:r>
+      <w:r>
+        <w:t xml:space="preserve">_</w:t>
+      </w:r>
+      <w:r>
+        <w:t xml:space="preserve">psl.0.1) [9]. The structures were relaxed with respect to both lattice parameters and atomic positions with Marzari–Vanderbilt smearing [10] of 0.01 Ry and a </w:t>
+      </w:r>
+      <w:r>
+        <w:rPr>
+          <w:i/>
+          <w:iCs/>
+        </w:rPr>
+        <w:t xml:space="preserve">k</w:t>
+      </w:r>
+      <w:r>
+        <w:t xml:space="preserve">-point spacing of at most 0.30 Å</w:t>
       </w:r>
       <w:r>
         <w:rPr>
@@ -461,7 +462,26 @@
         <w:t xml:space="preserve">−1</w:t>
       </w:r>
       <w:r>
-        <w:t xml:space="preserve"> above the hull, as no LiCl entry lies on the hull).</w:t>
+        <w:t xml:space="preserve"> (including the factor 2π). After an SCF calculation on the relaxed structure, a non-self-consistent calculation with fixed occupations was performed on a denser </w:t>
+      </w:r>
+      <w:r>
+        <w:rPr>
+          <w:i/>
+          <w:iCs/>
+        </w:rPr>
+        <w:t xml:space="preserve">k</w:t>
+      </w:r>
+      <w:r>
+        <w:t xml:space="preserve">-point grid (spacing of at most 0.15 Å</w:t>
+      </w:r>
+      <w:r>
+        <w:rPr>
+          <w:vertAlign w:val="superscript"/>
+        </w:rPr>
+        <w:t xml:space="preserve">−1</w:t>
+      </w:r>
+      <w:r>
+        <w:t xml:space="preserve">) with at least 35% more bands than occupied states, and the band gap was taken as the difference between the Kohn–Sham eigenvalues at the conduction band minimum and the valence band maximum.</w:t>
       </w:r>
     </w:p>
     <w:p>
@@ -672,16 +692,7 @@
         <w:t xml:space="preserve">0</w:t>
       </w:r>
       <w:r>
-        <w:t xml:space="preserve"> = −1.909 eV atom</w:t>
-      </w:r>
-      <w:r>
-        <w:rPr>
-          <w:vertAlign w:val="superscript"/>
-        </w:rPr>
-        <w:t xml:space="preserve">−1</w:t>
-      </w:r>
-      <w:r>
-        <w:t xml:space="preserve"> is the energy per atom of the lowest-energy elemental Li entry and </w:t>
+        <w:t xml:space="preserve"> is the energy per atom of Li metal (the lowest-energy elemental Li entry) and </w:t>
       </w:r>
       <w:r>
         <w:rPr>
@@ -1263,7 +1274,35 @@
         <w:jc w:val="both"/>
       </w:pPr>
       <w:r>
-        <w:t xml:space="preserve">The band gaps of the Nd-containing CEI components were calculated with PAW datasets from PSlibrary [9] (Li.pbe-sl-kjpaw</w:t>
+        <w:t xml:space="preserve">The band gaps of the Nd-containing CEI components, including NdP</w:t>
+      </w:r>
+      <w:r>
+        <w:rPr>
+          <w:vertAlign w:val="subscript"/>
+        </w:rPr>
+        <w:t xml:space="preserve">5</w:t>
+      </w:r>
+      <w:r>
+        <w:t xml:space="preserve">O</w:t>
+      </w:r>
+      <w:r>
+        <w:rPr>
+          <w:vertAlign w:val="subscript"/>
+        </w:rPr>
+        <w:t xml:space="preserve">14</w:t>
+      </w:r>
+      <w:r>
+        <w:t xml:space="preserve"> (mp-560681, </w:t>
+      </w:r>
+      <w:r>
+        <w:rPr>
+          <w:i/>
+          <w:iCs/>
+        </w:rPr>
+        <w:t xml:space="preserve">Pmna</w:t>
+      </w:r>
+      <w:r>
+        <w:t xml:space="preserve">), were calculated with the same procedure, but with PAW datasets from PSlibrary for all elements [9] (Li.pbe-sl-kjpaw</w:t>
       </w:r>
       <w:r>
         <w:t xml:space="preserve">_</w:t>
@@ -1319,45 +1358,7 @@
         <w:t xml:space="preserve">U</w:t>
       </w:r>
       <w:r>
-        <w:t xml:space="preserve"> correction was applied. The structures were taken from the Materials Project database [7] and relaxed with respect to both lattice parameters and atomic positions with Marzari–Vanderbilt smearing [10] of 0.01 Ry and a </w:t>
-      </w:r>
-      <w:r>
-        <w:rPr>
-          <w:i/>
-          <w:iCs/>
-        </w:rPr>
-        <w:t xml:space="preserve">k</w:t>
-      </w:r>
-      <w:r>
-        <w:t xml:space="preserve">-point spacing of at most 0.30 Å</w:t>
-      </w:r>
-      <w:r>
-        <w:rPr>
-          <w:vertAlign w:val="superscript"/>
-        </w:rPr>
-        <w:t xml:space="preserve">−1</w:t>
-      </w:r>
-      <w:r>
-        <w:t xml:space="preserve"> (including the factor 2π); the residual pressures were within ±1 kbar. After an SCF calculation on the relaxed structure, a non-self-consistent calculation with fixed occupations was performed on a denser </w:t>
-      </w:r>
-      <w:r>
-        <w:rPr>
-          <w:i/>
-          <w:iCs/>
-        </w:rPr>
-        <w:t xml:space="preserve">k</w:t>
-      </w:r>
-      <w:r>
-        <w:t xml:space="preserve">-point grid (spacing of at most 0.15 Å</w:t>
-      </w:r>
-      <w:r>
-        <w:rPr>
-          <w:vertAlign w:val="superscript"/>
-        </w:rPr>
-        <w:t xml:space="preserve">−1</w:t>
-      </w:r>
-      <w:r>
-        <w:t xml:space="preserve">) with at least 35% more bands than occupied states, and the band gap was taken as the difference between the Kohn–Sham eigenvalues at the conduction band minimum and the valence band maximum.</w:t>
+        <w:t xml:space="preserve"> correction was applied. After relaxation, the residual pressures were within ±1 kbar.</w:t>
       </w:r>
     </w:p>
     <w:p>

</xml_diff>

<commit_message>
NdO methods SI: drop the not-done sentences (user); keep the one-line Li3Nd model caveat
Removes "a larger-cell check was not possible ..." and "the cell-size convergence of
the Li2S barrier was not tested"; keeps one sentence that the Li3Nd barrier refers to
the locally reconstructed 2x2x2 model and is not cell-size converged (condition of
D-2026-10-26-li3nd-neb-si-conditional).

Co-Authored-By: Claude Opus 5.5 <noreply@anthropic.com>
Claude-Session: https://claude.ai/code/session_01QtbBQvJTvwH5CtkzA6CTzs
</commit_message>
<xml_diff>
--- a/kb/papers/ndo_lpscl16_methods_SI_2026_10_28.docx
+++ b/kb/papers/ndo_lpscl16_methods_SI_2026_10_28.docx
@@ -250,25 +250,7 @@
         <w:t xml:space="preserve">3</w:t>
       </w:r>
       <w:r>
-        <w:t xml:space="preserve">Nd, both vacancy endpoints reconstructed substantially on relaxation from the ideal lattice, so the barrier refers to this locally reconstructed 2 × 2 × 2 model. A larger-cell check was not possible, because the 3 × 3 × 3 CI-NEB did not converge and the 3 × 3 × 3 cells reconstructed substantially on relaxation; the Li</w:t>
-      </w:r>
-      <w:r>
-        <w:rPr>
-          <w:vertAlign w:val="subscript"/>
-        </w:rPr>
-        <w:t xml:space="preserve">3</w:t>
-      </w:r>
-      <w:r>
-        <w:t xml:space="preserve">Nd barrier is therefore not converged with respect to cell size. The cell-size convergence of the Li</w:t>
-      </w:r>
-      <w:r>
-        <w:rPr>
-          <w:vertAlign w:val="subscript"/>
-        </w:rPr>
-        <w:t xml:space="preserve">2</w:t>
-      </w:r>
-      <w:r>
-        <w:t xml:space="preserve">S barrier was not tested.</w:t>
+        <w:t xml:space="preserve">Nd, both vacancy endpoints reconstructed substantially on relaxation from the ideal lattice; the barrier therefore refers to this locally reconstructed 2 × 2 × 2 model and is not converged with respect to cell size.</w:t>
       </w:r>
     </w:p>
     <w:p>

</xml_diff>

<commit_message>
NdO methods SI: restore the Li3Nd 3x3x3 attempt clause (user)
"A check with a 3 x 3 x 3 supercell (107 atoms) was attempted, but its vacancy endpoints
also reconstructed substantially and the CI-NEB between them did not converge" -
an attempted check, not an omitted one; same meaning as the
D-2026-10-26-li3nd-neb-si-conditional SI sentence.

Co-Authored-By: Claude Opus 5.5 <noreply@anthropic.com>
Claude-Session: https://claude.ai/code/session_01QtbBQvJTvwH5CtkzA6CTzs
</commit_message>
<xml_diff>
--- a/kb/papers/ndo_lpscl16_methods_SI_2026_10_28.docx
+++ b/kb/papers/ndo_lpscl16_methods_SI_2026_10_28.docx
@@ -250,7 +250,16 @@
         <w:t xml:space="preserve">3</w:t>
       </w:r>
       <w:r>
-        <w:t xml:space="preserve">Nd, both vacancy endpoints reconstructed substantially on relaxation from the ideal lattice; the barrier therefore refers to this locally reconstructed 2 × 2 × 2 model and is not converged with respect to cell size.</w:t>
+        <w:t xml:space="preserve">Nd, both vacancy endpoints reconstructed substantially on relaxation from the ideal lattice, so the barrier refers to this locally reconstructed 2 × 2 × 2 model. A check with a 3 × 3 × 3 supercell (107 atoms) was attempted, but its vacancy endpoints also reconstructed substantially and the CI-NEB between them did not converge; the Li</w:t>
+      </w:r>
+      <w:r>
+        <w:rPr>
+          <w:vertAlign w:val="subscript"/>
+        </w:rPr>
+        <w:t xml:space="preserve">3</w:t>
+      </w:r>
+      <w:r>
+        <w:t xml:space="preserve">Nd barrier is therefore not converged with respect to cell size.</w:t>
       </w:r>
     </w:p>
     <w:p>

</xml_diff>

<commit_message>
NdO methods: drop bookkeeping details from SI, finalize compact main (user)
- SI (~680 words): removes query date/tool, pymatgen class name, PP file names and
  versions, 2pi note, band count, mixing, Broyden, CI selection, cell/hop distances,
  residual pressure and the intermediate-x check sentence
- main (~370 words): moves NEB image count, MP IDs, background charge, smearing,
  dense k grid, per-non-Li normalization, SE formulas and voltage range to the SI
- builder renumbers citations per variant (main 13 refs: Marzari-Vanderbilt dropped);
  SI defines the numbering; selftest 13 incl. negative paths, mutation-checked

Co-Authored-By: Claude Opus 5.5 <noreply@anthropic.com>
Claude-Session: https://claude.ai/code/session_01QtbBQvJTvwH5CtkzA6CTzs
</commit_message>
<xml_diff>
--- a/kb/papers/ndo_lpscl16_methods_SI_2026_10_28.docx
+++ b/kb/papers/ndo_lpscl16_methods_SI_2026_10_28.docx
@@ -21,7 +21,7 @@
         <w:jc w:val="both"/>
       </w:pPr>
       <w:r>
-        <w:t xml:space="preserve">DFT calculations were performed with Quantum ESPRESSO [1–3] using the Perdew–Burke–Ernzerhof (PBE) generalized gradient approximation (GGA) [4]. In all calculations, kinetic energy cutoffs of 60 and 480 Ry were used for the wavefunctions and charge density, respectively, the Brillouin zone was sampled with Γ-centered Monkhorst–Pack </w:t>
+        <w:t xml:space="preserve">DFT calculations were performed with Quantum ESPRESSO [1–3] using the Perdew–Burke–Ernzerhof (PBE) generalized gradient approximation (GGA) [4]. Kinetic energy cutoffs of 60 and 480 Ry were used for the wavefunctions and charge density, respectively, the Brillouin zone was sampled with Γ-centered Monkhorst–Pack </w:t>
       </w:r>
       <w:r>
         <w:rPr>
@@ -31,7 +31,7 @@
         <w:t xml:space="preserve">k</w:t>
       </w:r>
       <w:r>
-        <w:t xml:space="preserve">-point grids [5], and self-consistent field (SCF) calculations were converged to 10</w:t>
+        <w:t xml:space="preserve">-point grids [5], and self-consistent calculations were converged to 10</w:t>
       </w:r>
       <w:r>
         <w:rPr>
@@ -40,7 +40,7 @@
         <w:t xml:space="preserve">−8</w:t>
       </w:r>
       <w:r>
-        <w:t xml:space="preserve"> Ry with a mixing factor of 0.3.</w:t>
+        <w:t xml:space="preserve"> Ry.</w:t>
       </w:r>
     </w:p>
     <w:p>
@@ -127,13 +127,7 @@
         <w:t xml:space="preserve">m</w:t>
       </w:r>
       <w:r>
-        <w:t xml:space="preserve">; mp-976264, a hypothetical phase above the convex hull) were first relaxed with variable cell. Ultrasoft pseudopotentials from the GBRV library (v1.4) were used for Li and S [8], and the PAW dataset Nd.pbe-spdn-kjpaw</w:t>
-      </w:r>
-      <w:r>
-        <w:t xml:space="preserve">_</w:t>
-      </w:r>
-      <w:r>
-        <w:t xml:space="preserve">psl.1.0.0 from PSlibrary, in which the Nd 4</w:t>
+        <w:t xml:space="preserve">; mp-976264, a hypothetical phase above the convex hull) were first relaxed with variable cell. Ultrasoft GBRV pseudopotentials were used for Li and S [8], and a projector augmented-wave (PAW) dataset from PSlibrary with the Nd 4</w:t>
       </w:r>
       <w:r>
         <w:rPr>
@@ -143,7 +137,7 @@
         <w:t xml:space="preserve">f</w:t>
       </w:r>
       <w:r>
-        <w:t xml:space="preserve"> electrons are frozen in the core, was used for Nd [9]. Supercells of the primitive cells were then constructed, 3 × 3 × 3 for Li</w:t>
+        <w:t xml:space="preserve"> electrons frozen in the core was used for Nd [9]. The vacancies were placed in 3 × 3 × 3 (Li</w:t>
       </w:r>
       <w:r>
         <w:rPr>
@@ -152,7 +146,7 @@
         <w:t xml:space="preserve">2</w:t>
       </w:r>
       <w:r>
-        <w:t xml:space="preserve">S (80 atoms after vacancy creation, shortest lattice translation 12.1 Å, hop distance 2.85 Å) and 2 × 2 × 2 for Li</w:t>
+        <w:t xml:space="preserve">S, 80 atoms) and 2 × 2 × 2 (Li</w:t>
       </w:r>
       <w:r>
         <w:rPr>
@@ -161,7 +155,7 @@
         <w:t xml:space="preserve">3</w:t>
       </w:r>
       <w:r>
-        <w:t xml:space="preserve">Nd (31 atoms, shortest lattice translation 10.4 Å, hop distance 3.67 Å), and both were sampled with a 3 × 3 × 3 </w:t>
+        <w:t xml:space="preserve">Nd, 31 atoms) supercells of the primitive cells, sampled with a 3 × 3 × 3 </w:t>
       </w:r>
       <w:r>
         <w:rPr>
@@ -171,7 +165,7 @@
         <w:t xml:space="preserve">k</w:t>
       </w:r>
       <w:r>
-        <w:t xml:space="preserve">-point grid. Because Li</w:t>
+        <w:t xml:space="preserve">-point grid. The vacancy in the insulating Li</w:t>
       </w:r>
       <w:r>
         <w:rPr>
@@ -180,7 +174,7 @@
         <w:t xml:space="preserve">2</w:t>
       </w:r>
       <w:r>
-        <w:t xml:space="preserve">S is an insulator, its vacancy was modeled in the negatively charged state (V</w:t>
+        <w:t xml:space="preserve">S was modeled in the negatively charged state (V</w:t>
       </w:r>
       <w:r>
         <w:rPr>
@@ -195,7 +189,7 @@
         <w:t xml:space="preserve">−</w:t>
       </w:r>
       <w:r>
-        <w:t xml:space="preserve">; one extra electron per supercell compensated by a uniform background charge, without a finite-size correction) with Gaussian smearing of 0.005 Ry, whereas the vacancy in metallic Li</w:t>
+        <w:t xml:space="preserve">) with a uniform compensating background charge and Gaussian smearing of 0.005 Ry, whereas that in the metallic Li</w:t>
       </w:r>
       <w:r>
         <w:rPr>
@@ -232,7 +226,7 @@
         <w:t xml:space="preserve">−1</w:t>
       </w:r>
       <w:r>
-        <w:t xml:space="preserve">. The minimum-energy path was represented by seven images and optimized with the Broyden scheme, with the climbing image selected automatically, until the force component perpendicular to the path fell below 0.05 eV Å</w:t>
+        <w:t xml:space="preserve">, and the minimum-energy path, represented by seven images, was optimized until the force perpendicular to the path fell below 0.05 eV Å</w:t>
       </w:r>
       <w:r>
         <w:rPr>
@@ -250,7 +244,7 @@
         <w:t xml:space="preserve">3</w:t>
       </w:r>
       <w:r>
-        <w:t xml:space="preserve">Nd, both vacancy endpoints reconstructed substantially on relaxation from the ideal lattice, so the barrier refers to this locally reconstructed 2 × 2 × 2 model. A check with a 3 × 3 × 3 supercell (107 atoms) was attempted, but its vacancy endpoints also reconstructed substantially and the CI-NEB between them did not converge; the Li</w:t>
+        <w:t xml:space="preserve">Nd, both vacancy endpoints reconstructed substantially on relaxation from the ideal lattice, so the barrier refers to this locally reconstructed 2 × 2 × 2 model. A check with a 3 × 3 × 3 supercell was attempted, but its vacancy endpoints also reconstructed substantially and the CI-NEB between them did not converge; the Li</w:t>
       </w:r>
       <w:r>
         <w:rPr>
@@ -422,19 +416,7 @@
         <w:t xml:space="preserve">m</w:t>
       </w:r>
       <w:r>
-        <w:t xml:space="preserve">), whose structures were taken from the Materials Project database [7]. Ultrasoft GBRV pseudopotentials (v1.4) were used for Li, S, and Cl [8], and PSlibrary datasets were used for P (ultrasoft, P.pbe-n-rrkjus</w:t>
-      </w:r>
-      <w:r>
-        <w:t xml:space="preserve">_</w:t>
-      </w:r>
-      <w:r>
-        <w:t xml:space="preserve">psl.1.0.0) and O (PAW, O.pbe-n-kjpaw</w:t>
-      </w:r>
-      <w:r>
-        <w:t xml:space="preserve">_</w:t>
-      </w:r>
-      <w:r>
-        <w:t xml:space="preserve">psl.0.1) [9]. The structures were relaxed with respect to both lattice parameters and atomic positions with Marzari–Vanderbilt smearing [10] of 0.01 Ry and a </w:t>
+        <w:t xml:space="preserve">), starting from the Materials Project structures [7]. Ultrasoft GBRV pseudopotentials were used for Li, S, and Cl [8], and PSlibrary datasets for P (ultrasoft) and O (PAW) [9]. The structures were fully relaxed with Marzari–Vanderbilt smearing [10] of 0.01 Ry and a </w:t>
       </w:r>
       <w:r>
         <w:rPr>
@@ -444,7 +426,7 @@
         <w:t xml:space="preserve">k</w:t>
       </w:r>
       <w:r>
-        <w:t xml:space="preserve">-point spacing of at most 0.30 Å</w:t>
+        <w:t xml:space="preserve">-point spacing of 0.30 Å</w:t>
       </w:r>
       <w:r>
         <w:rPr>
@@ -453,7 +435,7 @@
         <w:t xml:space="preserve">−1</w:t>
       </w:r>
       <w:r>
-        <w:t xml:space="preserve"> (including the factor 2π). After an SCF calculation on the relaxed structure, a non-self-consistent calculation with fixed occupations was performed on a denser </w:t>
+        <w:t xml:space="preserve">, and the band gap was obtained from the Kohn–Sham eigenvalues at the valence band maximum and conduction band minimum of a non-self-consistent calculation with fixed occupations on a denser </w:t>
       </w:r>
       <w:r>
         <w:rPr>
@@ -463,7 +445,7 @@
         <w:t xml:space="preserve">k</w:t>
       </w:r>
       <w:r>
-        <w:t xml:space="preserve">-point grid (spacing of at most 0.15 Å</w:t>
+        <w:t xml:space="preserve">-point grid (spacing 0.15 Å</w:t>
       </w:r>
       <w:r>
         <w:rPr>
@@ -472,7 +454,7 @@
         <w:t xml:space="preserve">−1</w:t>
       </w:r>
       <w:r>
-        <w:t xml:space="preserve">) with at least 35% more bands than occupied states, and the band gap was taken as the difference between the Kohn–Sham eigenvalues at the conduction band minimum and the valence band maximum.</w:t>
+        <w:t xml:space="preserve">).</w:t>
       </w:r>
     </w:p>
     <w:p>
@@ -518,7 +500,17 @@
         <w:t xml:space="preserve">2</w:t>
       </w:r>
       <w:r>
-        <w:t xml:space="preserve">) were calculated following the approach of Richards et al. [11], with the GrandPotentialInterfacialReactivity class of pymatgen [12]. For each SE/NCM pair, the entries of the corresponding chemical system (Li–Ni–Co–Mn–P–S–O–Cl, with Nd added for NdO-LPSCl</w:t>
+        <w:t xml:space="preserve">) were calculated following the approach of Richards et al. [11], as implemented in pymatgen [12], using Materials Project energies [7] in the mixed GGA/GGA+</w:t>
+      </w:r>
+      <w:r>
+        <w:rPr>
+          <w:i/>
+          <w:iCs/>
+        </w:rPr>
+        <w:t xml:space="preserve">U</w:t>
+      </w:r>
+      <w:r>
+        <w:t xml:space="preserve"> scheme [13]. LPSCl</w:t>
       </w:r>
       <w:r>
         <w:rPr>
@@ -527,23 +519,25 @@
         <w:t xml:space="preserve">1.6</w:t>
       </w:r>
       <w:r>
-        <w:t xml:space="preserve">) were retrieved from the Materials Project database [7] with mixed GGA/GGA+</w:t>
-      </w:r>
-      <w:r>
-        <w:rPr>
-          <w:i/>
-          <w:iCs/>
-        </w:rPr>
-        <w:t xml:space="preserve">U</w:t>
-      </w:r>
-      <w:r>
-        <w:t xml:space="preserve"> energies [13] (queried with the mp</w:t>
-      </w:r>
-      <w:r>
-        <w:t xml:space="preserve">_</w:t>
-      </w:r>
-      <w:r>
-        <w:t xml:space="preserve">api client in September 2026). LPSCl</w:t>
+        <w:t xml:space="preserve"> (Li</w:t>
+      </w:r>
+      <w:r>
+        <w:rPr>
+          <w:vertAlign w:val="subscript"/>
+        </w:rPr>
+        <w:t xml:space="preserve">5.4</w:t>
+      </w:r>
+      <w:r>
+        <w:t xml:space="preserve">PS</w:t>
+      </w:r>
+      <w:r>
+        <w:rPr>
+          <w:vertAlign w:val="subscript"/>
+        </w:rPr>
+        <w:t xml:space="preserve">4.4</w:t>
+      </w:r>
+      <w:r>
+        <w:t xml:space="preserve">Cl</w:t>
       </w:r>
       <w:r>
         <w:rPr>
@@ -552,22 +546,58 @@
         <w:t xml:space="preserve">1.6</w:t>
       </w:r>
       <w:r>
+        <w:t xml:space="preserve">) and NdO-LPSCl</w:t>
+      </w:r>
+      <w:r>
+        <w:rPr>
+          <w:vertAlign w:val="subscript"/>
+        </w:rPr>
+        <w:t xml:space="preserve">1.6</w:t>
+      </w:r>
+      <w:r>
         <w:t xml:space="preserve"> (Li</w:t>
       </w:r>
       <w:r>
         <w:rPr>
           <w:vertAlign w:val="subscript"/>
         </w:rPr>
-        <w:t xml:space="preserve">5.4</w:t>
-      </w:r>
-      <w:r>
-        <w:t xml:space="preserve">PS</w:t>
-      </w:r>
-      <w:r>
-        <w:rPr>
-          <w:vertAlign w:val="subscript"/>
-        </w:rPr>
-        <w:t xml:space="preserve">4.4</w:t>
+        <w:t xml:space="preserve">5.44</w:t>
+      </w:r>
+      <w:r>
+        <w:t xml:space="preserve">Nd</w:t>
+      </w:r>
+      <w:r>
+        <w:rPr>
+          <w:vertAlign w:val="subscript"/>
+        </w:rPr>
+        <w:t xml:space="preserve">0.02</w:t>
+      </w:r>
+      <w:r>
+        <w:t xml:space="preserve">P</w:t>
+      </w:r>
+      <w:r>
+        <w:rPr>
+          <w:vertAlign w:val="subscript"/>
+        </w:rPr>
+        <w:t xml:space="preserve">0.98</w:t>
+      </w:r>
+      <w:r>
+        <w:t xml:space="preserve">S</w:t>
+      </w:r>
+      <w:r>
+        <w:rPr>
+          <w:vertAlign w:val="subscript"/>
+        </w:rPr>
+        <w:t xml:space="preserve">4.37</w:t>
+      </w:r>
+      <w:r>
+        <w:t xml:space="preserve">O</w:t>
+      </w:r>
+      <w:r>
+        <w:rPr>
+          <w:vertAlign w:val="subscript"/>
+        </w:rPr>
+        <w:t xml:space="preserve">0.03</w:t>
       </w:r>
       <w:r>
         <w:t xml:space="preserve">Cl</w:t>
@@ -579,70 +609,7 @@
         <w:t xml:space="preserve">1.6</w:t>
       </w:r>
       <w:r>
-        <w:t xml:space="preserve">) and NdO-LPSCl</w:t>
-      </w:r>
-      <w:r>
-        <w:rPr>
-          <w:vertAlign w:val="subscript"/>
-        </w:rPr>
-        <w:t xml:space="preserve">1.6</w:t>
-      </w:r>
-      <w:r>
-        <w:t xml:space="preserve"> (Li</w:t>
-      </w:r>
-      <w:r>
-        <w:rPr>
-          <w:vertAlign w:val="subscript"/>
-        </w:rPr>
-        <w:t xml:space="preserve">5.44</w:t>
-      </w:r>
-      <w:r>
-        <w:t xml:space="preserve">Nd</w:t>
-      </w:r>
-      <w:r>
-        <w:rPr>
-          <w:vertAlign w:val="subscript"/>
-        </w:rPr>
-        <w:t xml:space="preserve">0.02</w:t>
-      </w:r>
-      <w:r>
-        <w:t xml:space="preserve">P</w:t>
-      </w:r>
-      <w:r>
-        <w:rPr>
-          <w:vertAlign w:val="subscript"/>
-        </w:rPr>
-        <w:t xml:space="preserve">0.98</w:t>
-      </w:r>
-      <w:r>
-        <w:t xml:space="preserve">S</w:t>
-      </w:r>
-      <w:r>
-        <w:rPr>
-          <w:vertAlign w:val="subscript"/>
-        </w:rPr>
-        <w:t xml:space="preserve">4.37</w:t>
-      </w:r>
-      <w:r>
-        <w:t xml:space="preserve">O</w:t>
-      </w:r>
-      <w:r>
-        <w:rPr>
-          <w:vertAlign w:val="subscript"/>
-        </w:rPr>
-        <w:t xml:space="preserve">0.03</w:t>
-      </w:r>
-      <w:r>
-        <w:t xml:space="preserve">Cl</w:t>
-      </w:r>
-      <w:r>
-        <w:rPr>
-          <w:vertAlign w:val="subscript"/>
-        </w:rPr>
-        <w:t xml:space="preserve">1.6</w:t>
-      </w:r>
-      <w:r>
-        <w:t xml:space="preserve">), which are not in the database, were represented by the convex-hull energies at their compositions. The interface was treated as open to a Li reservoir whose chemical potential was set by the applied voltage </w:t>
+        <w:t xml:space="preserve">) were represented by the convex-hull energies at their compositions. The interface was treated as open to Li, with the Li chemical potential set by the applied voltage </w:t>
       </w:r>
       <w:r>
         <w:rPr>
@@ -683,7 +650,7 @@
         <w:t xml:space="preserve">0</w:t>
       </w:r>
       <w:r>
-        <w:t xml:space="preserve"> is the energy per atom of Li metal (the lowest-energy elemental Li entry) and </w:t>
+        <w:t xml:space="preserve"> is the chemical potential of Li metal and </w:t>
       </w:r>
       <w:r>
         <w:rPr>
@@ -719,7 +686,7 @@
         <w:t xml:space="preserve">Li</w:t>
       </w:r>
       <w:r>
-        <w:t xml:space="preserve"> is its number of Li atoms, the reaction energy at each voltage was obtained from Eq. (S3), where </w:t>
+        <w:t xml:space="preserve"> is its number of Li atoms, the reaction energy was obtained from Eq. (S3), where </w:t>
       </w:r>
       <w:r>
         <w:rPr>
@@ -729,7 +696,23 @@
         <w:t xml:space="preserve">x</w:t>
       </w:r>
       <w:r>
-        <w:t xml:space="preserve"> (0 ≤ </w:t>
+        <w:t xml:space="preserve"> is the fraction of SE in the SE/NCM mixture, </w:t>
+      </w:r>
+      <w:r>
+        <w:rPr>
+          <w:i/>
+          <w:iCs/>
+        </w:rPr>
+        <w:t xml:space="preserve">Φ</w:t>
+      </w:r>
+      <w:r>
+        <w:rPr>
+          <w:vertAlign w:val="subscript"/>
+        </w:rPr>
+        <w:t xml:space="preserve">eq</w:t>
+      </w:r>
+      <w:r>
+        <w:t xml:space="preserve">(</w:t>
       </w:r>
       <w:r>
         <w:rPr>
@@ -739,7 +722,7 @@
         <w:t xml:space="preserve">x</w:t>
       </w:r>
       <w:r>
-        <w:t xml:space="preserve"> ≤ 1) is the fraction of SE in the SE/NCM mixture, </w:t>
+        <w:t xml:space="preserve">) is the grand potential of the equilibrium phases of the mixture, and </w:t>
       </w:r>
       <w:r>
         <w:rPr>
@@ -752,10 +735,26 @@
         <w:rPr>
           <w:vertAlign w:val="subscript"/>
         </w:rPr>
-        <w:t xml:space="preserve">eq</w:t>
-      </w:r>
-      <w:r>
-        <w:t xml:space="preserve">(</w:t>
+        <w:t xml:space="preserve">SE</w:t>
+      </w:r>
+      <w:r>
+        <w:t xml:space="preserve"> and </w:t>
+      </w:r>
+      <w:r>
+        <w:rPr>
+          <w:i/>
+          <w:iCs/>
+        </w:rPr>
+        <w:t xml:space="preserve">Φ</w:t>
+      </w:r>
+      <w:r>
+        <w:rPr>
+          <w:vertAlign w:val="subscript"/>
+        </w:rPr>
+        <w:t xml:space="preserve">NCM</w:t>
+      </w:r>
+      <w:r>
+        <w:t xml:space="preserve"> are those of the unreacted SE and NCM; all grand potentials were normalized per atom excluding Li. The calculations were performed at six voltages between 2.5 and 4.5 V, and the reaction products were taken from the equilibrium phases at the minimizing </w:t>
       </w:r>
       <w:r>
         <w:rPr>
@@ -765,69 +764,7 @@
         <w:t xml:space="preserve">x</w:t>
       </w:r>
       <w:r>
-        <w:t xml:space="preserve">) is the grand potential of the equilibrium phases at the composition of the mixture, and </w:t>
-      </w:r>
-      <w:r>
-        <w:rPr>
-          <w:i/>
-          <w:iCs/>
-        </w:rPr>
-        <w:t xml:space="preserve">Φ</w:t>
-      </w:r>
-      <w:r>
-        <w:rPr>
-          <w:vertAlign w:val="subscript"/>
-        </w:rPr>
-        <w:t xml:space="preserve">SE</w:t>
-      </w:r>
-      <w:r>
-        <w:t xml:space="preserve"> and </w:t>
-      </w:r>
-      <w:r>
-        <w:rPr>
-          <w:i/>
-          <w:iCs/>
-        </w:rPr>
-        <w:t xml:space="preserve">Φ</w:t>
-      </w:r>
-      <w:r>
-        <w:rPr>
-          <w:vertAlign w:val="subscript"/>
-        </w:rPr>
-        <w:t xml:space="preserve">NCM</w:t>
-      </w:r>
-      <w:r>
-        <w:t xml:space="preserve"> are the grand potentials of the unreacted SE and NCM evaluated from their convex-hull energies; all grand potentials were normalized per atom excluding Li. The calculations were performed at </w:t>
-      </w:r>
-      <w:r>
-        <w:rPr>
-          <w:i/>
-          <w:iCs/>
-        </w:rPr>
-        <w:t xml:space="preserve">φ</w:t>
-      </w:r>
-      <w:r>
-        <w:t xml:space="preserve"> = 2.5, 3.0, 3.5, 4.0, 4.3, and 4.5 V, and the reaction products were taken from the equilibrium phases at the minimizing </w:t>
-      </w:r>
-      <w:r>
-        <w:rPr>
-          <w:i/>
-          <w:iCs/>
-        </w:rPr>
-        <w:t xml:space="preserve">x</w:t>
-      </w:r>
-      <w:r>
-        <w:t xml:space="preserve">. At every voltage, the minimum for both SEs lies at an intermediate mixing fraction (0 &lt; </w:t>
-      </w:r>
-      <w:r>
-        <w:rPr>
-          <w:i/>
-          <w:iCs/>
-        </w:rPr>
-        <w:t xml:space="preserve">x</w:t>
-      </w:r>
-      <w:r>
-        <w:t xml:space="preserve"> &lt; 1), that is, the reaction involves both the SE and NCM.</w:t>
+        <w:t xml:space="preserve">.</w:t>
       </w:r>
     </w:p>
     <w:p>
@@ -1293,43 +1230,7 @@
         <w:t xml:space="preserve">Pmna</w:t>
       </w:r>
       <w:r>
-        <w:t xml:space="preserve">), were calculated with the same procedure, but with PAW datasets from PSlibrary for all elements [9] (Li.pbe-sl-kjpaw</w:t>
-      </w:r>
-      <w:r>
-        <w:t xml:space="preserve">_</w:t>
-      </w:r>
-      <w:r>
-        <w:t xml:space="preserve">psl.1.0.0, P.pbe-n-kjpaw</w:t>
-      </w:r>
-      <w:r>
-        <w:t xml:space="preserve">_</w:t>
-      </w:r>
-      <w:r>
-        <w:t xml:space="preserve">psl.1.0.0, S.pbe-nl-kjpaw</w:t>
-      </w:r>
-      <w:r>
-        <w:t xml:space="preserve">_</w:t>
-      </w:r>
-      <w:r>
-        <w:t xml:space="preserve">psl.1.0.0, Cl.pbe-nl-kjpaw</w:t>
-      </w:r>
-      <w:r>
-        <w:t xml:space="preserve">_</w:t>
-      </w:r>
-      <w:r>
-        <w:t xml:space="preserve">psl.1.0.0, O.pbe-n-kjpaw</w:t>
-      </w:r>
-      <w:r>
-        <w:t xml:space="preserve">_</w:t>
-      </w:r>
-      <w:r>
-        <w:t xml:space="preserve">psl.0.1, and Nd.pbe-spdn-kjpaw</w:t>
-      </w:r>
-      <w:r>
-        <w:t xml:space="preserve">_</w:t>
-      </w:r>
-      <w:r>
-        <w:t xml:space="preserve">psl.1.0.0). Because the Nd 4</w:t>
+        <w:t xml:space="preserve">), were calculated with the same procedure, but with PAW datasets from PSlibrary for all elements [9]. Because the Nd 4</w:t>
       </w:r>
       <w:r>
         <w:rPr>
@@ -1349,7 +1250,7 @@
         <w:t xml:space="preserve">U</w:t>
       </w:r>
       <w:r>
-        <w:t xml:space="preserve"> correction was applied. After relaxation, the residual pressures were within ±1 kbar.</w:t>
+        <w:t xml:space="preserve"> correction was applied.</w:t>
       </w:r>
     </w:p>
     <w:p>

</xml_diff>

<commit_message>
NdO methods: pre-send review fixes (8c hop for Li3Nd, primitive-cell supercells, NCM hull energy, SI abbreviations)
- main: "nearest-neighbor Li sites" -> 8c sites (in Li3Nd the nearest Li pair is 4b-8c);
  supercells stated as primitive-cell supercells; SEs and NCM both represented by
  convex-hull energies (use_hull_energy applies to both reactants); sentence fixes
- SI: image count includes the two endpoints; SE defined; NCM hull energy; CEI spelled out

Co-Authored-By: Claude Opus 5.5 <noreply@anthropic.com>
Claude-Session: https://claude.ai/code/session_01QtbBQvJTvwH5CtkzA6CTzs
</commit_message>
<xml_diff>
--- a/kb/papers/ndo_lpscl16_methods_SI_2026_10_28.docx
+++ b/kb/papers/ndo_lpscl16_methods_SI_2026_10_28.docx
@@ -226,7 +226,7 @@
         <w:t xml:space="preserve">−1</w:t>
       </w:r>
       <w:r>
-        <w:t xml:space="preserve">, and the minimum-energy path, represented by seven images, was optimized until the force perpendicular to the path fell below 0.05 eV Å</w:t>
+        <w:t xml:space="preserve">, and the minimum-energy path, represented by seven images including the two endpoints, was optimized until the force perpendicular to the path fell below 0.05 eV Å</w:t>
       </w:r>
       <w:r>
         <w:rPr>
@@ -464,7 +464,7 @@
         <w:jc w:val="both"/>
       </w:pPr>
       <w:r>
-        <w:t xml:space="preserve">Interfacial reaction energies between the SEs and NCM (LiNi</w:t>
+        <w:t xml:space="preserve">Interfacial reaction energies between the solid electrolytes (SEs) and NCM (LiNi</w:t>
       </w:r>
       <w:r>
         <w:rPr>
@@ -546,7 +546,7 @@
         <w:t xml:space="preserve">1.6</w:t>
       </w:r>
       <w:r>
-        <w:t xml:space="preserve">) and NdO-LPSCl</w:t>
+        <w:t xml:space="preserve">), NdO-LPSCl</w:t>
       </w:r>
       <w:r>
         <w:rPr>
@@ -609,7 +609,7 @@
         <w:t xml:space="preserve">1.6</w:t>
       </w:r>
       <w:r>
-        <w:t xml:space="preserve">) were represented by the convex-hull energies at their compositions. The interface was treated as open to Li, with the Li chemical potential set by the applied voltage </w:t>
+        <w:t xml:space="preserve">), and NCM were represented by the convex-hull energies at their compositions. The interface was treated as open to Li, with the Li chemical potential set by the applied voltage </w:t>
       </w:r>
       <w:r>
         <w:rPr>
@@ -1202,7 +1202,7 @@
         <w:jc w:val="both"/>
       </w:pPr>
       <w:r>
-        <w:t xml:space="preserve">The band gaps of the Nd-containing CEI components, including NdP</w:t>
+        <w:t xml:space="preserve">The band gaps of the Nd-containing cathode–electrolyte interphase components, including NdP</w:t>
       </w:r>
       <w:r>
         <w:rPr>

</xml_diff>

<commit_message>
NdO methods: apply independent review (22 items) to main and SI
Verified each finding against records before applying: reaction energy
includes each reactant's decomposition (open-system reference), x on a
per-atom basis excluding Li, listed voltages, MP2020 corrections with
Wang et al. 2021 (SI 15 refs, main 14), PBE gap caveat, Nd spin/U moved
to the NEB paragraph with the 4f-states note, Fig. SX singular, clearer
NEB model sentences. Kept the ratified 'not converged' wording and the
user's earlier trims (2pi note, finite-size sentence).

Li3Nd SI caveat tail stays out of this manuscript only: amendment
D-2026-10-28-li3nd-neb-si-ndo-tail ratified by the user, noted on
HZ-li3nd-neb-si-conditional.

Co-Authored-By: Claude Opus 5.5 <noreply@anthropic.com>
Claude-Session: https://claude.ai/code/session_01QtbBQvJTvwH5CtkzA6CTzs
</commit_message>
<xml_diff>
--- a/kb/papers/ndo_lpscl16_methods_SI_2026_10_28.docx
+++ b/kb/papers/ndo_lpscl16_methods_SI_2026_10_28.docx
@@ -21,7 +21,7 @@
         <w:jc w:val="both"/>
       </w:pPr>
       <w:r>
-        <w:t xml:space="preserve">DFT calculations were performed with Quantum ESPRESSO [1–3] using the Perdew–Burke–Ernzerhof (PBE) generalized gradient approximation (GGA) [4]. Kinetic energy cutoffs of 60 and 480 Ry were used for the wavefunctions and charge density, respectively, the Brillouin zone was sampled with Γ-centered Monkhorst–Pack </w:t>
+        <w:t xml:space="preserve">DFT calculations were performed with Quantum ESPRESSO [1–3] using the Perdew–Burke–Ernzerhof (PBE) generalized gradient approximation (GGA) [4]. Kinetic energy cutoffs of 60 and 480 Ry were used for the wavefunctions and charge density, respectively. The Brillouin zone was sampled with Γ-centered Monkhorst–Pack </w:t>
       </w:r>
       <w:r>
         <w:rPr>
@@ -31,7 +31,7 @@
         <w:t xml:space="preserve">k</w:t>
       </w:r>
       <w:r>
-        <w:t xml:space="preserve">-point grids [5], and self-consistent calculations were converged to 10</w:t>
+        <w:t xml:space="preserve">-point grids [5], and the self-consistent field was converged to an estimated energy error below 10</w:t>
       </w:r>
       <w:r>
         <w:rPr>
@@ -69,7 +69,7 @@
         <w:t xml:space="preserve">2</w:t>
       </w:r>
       <w:r>
-        <w:t xml:space="preserve">S (</w:t>
+        <w:t xml:space="preserve">S (mp-1153, </w:t>
       </w:r>
       <w:r>
         <w:rPr>
@@ -89,7 +89,7 @@
         <w:t xml:space="preserve">m</w:t>
       </w:r>
       <w:r>
-        <w:t xml:space="preserve">; mp-1153 in the Materials Project database [7]) and an ordered BiF</w:t>
+        <w:t xml:space="preserve">) and a hypothetical ordered BiF</w:t>
       </w:r>
       <w:r>
         <w:rPr>
@@ -107,7 +107,7 @@
         <w:t xml:space="preserve">3</w:t>
       </w:r>
       <w:r>
-        <w:t xml:space="preserve">Nd model (</w:t>
+        <w:t xml:space="preserve">Nd model (mp-976264, </w:t>
       </w:r>
       <w:r>
         <w:rPr>
@@ -127,7 +127,7 @@
         <w:t xml:space="preserve">m</w:t>
       </w:r>
       <w:r>
-        <w:t xml:space="preserve">; mp-976264, a hypothetical phase above the convex hull) were first relaxed with variable cell. Ultrasoft GBRV pseudopotentials were used for Li and S [8], and a projector augmented-wave (PAW) dataset from PSlibrary with the Nd 4</w:t>
+        <w:t xml:space="preserve">; above the convex hull), both taken from the Materials Project database [7], were first relaxed with respect to atomic positions and lattice parameters. GBRV ultrasoft pseudopotentials were used for Li and S [8], and a projector augmented-wave (PAW) dataset from PSlibrary with the Nd 4</w:t>
       </w:r>
       <w:r>
         <w:rPr>
@@ -137,7 +137,27 @@
         <w:t xml:space="preserve">f</w:t>
       </w:r>
       <w:r>
-        <w:t xml:space="preserve"> electrons frozen in the core was used for Nd [9]. The vacancies were placed in 3 × 3 × 3 (Li</w:t>
+        <w:t xml:space="preserve"> electrons frozen in the core was used for Nd [9]. Because the Nd 4</w:t>
+      </w:r>
+      <w:r>
+        <w:rPr>
+          <w:i/>
+          <w:iCs/>
+        </w:rPr>
+        <w:t xml:space="preserve">f</w:t>
+      </w:r>
+      <w:r>
+        <w:t xml:space="preserve"> electrons are in the core, all Nd-containing calculations were non-spin-polarized, and no Hubbard </w:t>
+      </w:r>
+      <w:r>
+        <w:rPr>
+          <w:i/>
+          <w:iCs/>
+        </w:rPr>
+        <w:t xml:space="preserve">U</w:t>
+      </w:r>
+      <w:r>
+        <w:t xml:space="preserve"> correction was applied. The vacancies were placed in 3 × 3 × 3 (Li</w:t>
       </w:r>
       <w:r>
         <w:rPr>
@@ -155,7 +175,7 @@
         <w:t xml:space="preserve">3</w:t>
       </w:r>
       <w:r>
-        <w:t xml:space="preserve">Nd, 31 atoms) supercells of the primitive cells, sampled with a 3 × 3 × 3 </w:t>
+        <w:t xml:space="preserve">Nd, 31 atoms) supercells of the primitive cells, with a 3 × 3 × 3 </w:t>
       </w:r>
       <w:r>
         <w:rPr>
@@ -165,7 +185,7 @@
         <w:t xml:space="preserve">k</w:t>
       </w:r>
       <w:r>
-        <w:t xml:space="preserve">-point grid. The vacancy in the insulating Li</w:t>
+        <w:t xml:space="preserve">-point grid for both. The vacancy in insulating Li</w:t>
       </w:r>
       <w:r>
         <w:rPr>
@@ -189,7 +209,7 @@
         <w:t xml:space="preserve">−</w:t>
       </w:r>
       <w:r>
-        <w:t xml:space="preserve">) with a uniform compensating background charge and Gaussian smearing of 0.005 Ry, whereas that in the metallic Li</w:t>
+        <w:t xml:space="preserve">) with a uniform compensating background charge and Gaussian smearing of 0.005 Ry, whereas that in metallic Li</w:t>
       </w:r>
       <w:r>
         <w:rPr>
@@ -208,7 +228,7 @@
         <w:jc w:val="both"/>
       </w:pPr>
       <w:r>
-        <w:t xml:space="preserve">The two vacancy endpoints were relaxed at fixed cell until all force components were below 10</w:t>
+        <w:t xml:space="preserve">The two endpoint configurations were relaxed with the cell fixed until all force components were below 10</w:t>
       </w:r>
       <w:r>
         <w:rPr>
@@ -226,7 +246,7 @@
         <w:t xml:space="preserve">−1</w:t>
       </w:r>
       <w:r>
-        <w:t xml:space="preserve">, and the minimum-energy path, represented by seven images including the two endpoints, was optimized until the force perpendicular to the path fell below 0.05 eV Å</w:t>
+        <w:t xml:space="preserve">, and the minimum-energy path, represented by seven images including the two endpoints, was optimized until the force perpendicular to the path on every image fell below 0.05 eV Å</w:t>
       </w:r>
       <w:r>
         <w:rPr>
@@ -416,7 +436,7 @@
         <w:t xml:space="preserve">m</w:t>
       </w:r>
       <w:r>
-        <w:t xml:space="preserve">), starting from the Materials Project structures [7]. Ultrasoft GBRV pseudopotentials were used for Li, S, and Cl [8], and PSlibrary datasets for P (ultrasoft) and O (PAW) [9]. The structures were fully relaxed with Marzari–Vanderbilt smearing [10] of 0.01 Ry and a </w:t>
+        <w:t xml:space="preserve">), starting from the Materials Project structures [7]. GBRV ultrasoft pseudopotentials were used for Li, S, and Cl [8], and PSlibrary datasets were used for P (ultrasoft) and O (PAW) [9]. The full relaxation and the subsequent self-consistent calculation used Marzari–Vanderbilt smearing [10] of 0.01 Ry and a </w:t>
       </w:r>
       <w:r>
         <w:rPr>
@@ -435,7 +455,7 @@
         <w:t xml:space="preserve">−1</w:t>
       </w:r>
       <w:r>
-        <w:t xml:space="preserve">, and the band gap was obtained from the Kohn–Sham eigenvalues at the valence band maximum and conduction band minimum of a non-self-consistent calculation with fixed occupations on a denser </w:t>
+        <w:t xml:space="preserve">. The band gap was then taken as the difference between the lowest unoccupied and highest occupied Kohn–Sham eigenvalues of a non-self-consistent calculation with fixed occupations on a denser </w:t>
       </w:r>
       <w:r>
         <w:rPr>
@@ -454,7 +474,7 @@
         <w:t xml:space="preserve">−1</w:t>
       </w:r>
       <w:r>
-        <w:t xml:space="preserve">).</w:t>
+        <w:t xml:space="preserve">), based on the self-consistent charge density. Because PBE is known to underestimate band gaps, the calculated values were used for comparison among the phases.</w:t>
       </w:r>
     </w:p>
     <w:p>
@@ -510,7 +530,7 @@
         <w:t xml:space="preserve">U</w:t>
       </w:r>
       <w:r>
-        <w:t xml:space="preserve"> scheme [13]. LPSCl</w:t>
+        <w:t xml:space="preserve"> scheme [13] with the MP2020 energy corrections [14]. LPSCl</w:t>
       </w:r>
       <w:r>
         <w:rPr>
@@ -628,7 +648,7 @@
         <w:t xml:space="preserve">+</w:t>
       </w:r>
       <w:r>
-        <w:t xml:space="preserve">) through Eq. (S1) [14], where </w:t>
+        <w:t xml:space="preserve">) through Eq. (S1) [15], where </w:t>
       </w:r>
       <w:r>
         <w:rPr>
@@ -660,7 +680,7 @@
         <w:t xml:space="preserve">e</w:t>
       </w:r>
       <w:r>
-        <w:t xml:space="preserve"> is the elementary charge. With the grand potential of each phase defined by Eq. (S2), where </w:t>
+        <w:t xml:space="preserve"> is the elementary charge. The grand potential of a phase or phase assemblage is given by Eq. (S2), where </w:t>
       </w:r>
       <w:r>
         <w:rPr>
@@ -686,7 +706,7 @@
         <w:t xml:space="preserve">Li</w:t>
       </w:r>
       <w:r>
-        <w:t xml:space="preserve"> is its number of Li atoms, the reaction energy was obtained from Eq. (S3), where </w:t>
+        <w:t xml:space="preserve"> is its number of Li atoms; all grand potentials were normalized per atom excluding Li. The reaction energy was obtained from Eq. (S3), where </w:t>
       </w:r>
       <w:r>
         <w:rPr>
@@ -696,7 +716,7 @@
         <w:t xml:space="preserve">x</w:t>
       </w:r>
       <w:r>
-        <w:t xml:space="preserve"> is the fraction of SE in the SE/NCM mixture, </w:t>
+        <w:t xml:space="preserve"> is the fraction of SE in the SE/NCM mixture (per atom excluding Li), </w:t>
       </w:r>
       <w:r>
         <w:rPr>
@@ -754,7 +774,7 @@
         <w:t xml:space="preserve">NCM</w:t>
       </w:r>
       <w:r>
-        <w:t xml:space="preserve"> are those of the unreacted SE and NCM; all grand potentials were normalized per atom excluding Li. The calculations were performed at six voltages between 2.5 and 4.5 V, and the reaction products were taken from the equilibrium phases at the minimizing </w:t>
+        <w:t xml:space="preserve"> are those of the unreacted SE and NCM. Because the unreacted SE and NCM served as the reference, the reaction energy also includes the decomposition of each reactant at the applied voltage, in addition to their mutual reaction. The calculations were performed at 2.5, 3.0, 3.5, 4.0, 4.3, and 4.5 V, and the reaction products were taken from the equilibrium phases at the minimizing </w:t>
       </w:r>
       <w:r>
         <w:rPr>
@@ -1202,7 +1222,7 @@
         <w:jc w:val="both"/>
       </w:pPr>
       <w:r>
-        <w:t xml:space="preserve">The band gaps of the Nd-containing cathode–electrolyte interphase components, including NdP</w:t>
+        <w:t xml:space="preserve">The band gap of the Nd-containing cathode–electrolyte interphase component NdP</w:t>
       </w:r>
       <w:r>
         <w:rPr>
@@ -1230,7 +1250,7 @@
         <w:t xml:space="preserve">Pmna</w:t>
       </w:r>
       <w:r>
-        <w:t xml:space="preserve">), were calculated with the same procedure, but with PAW datasets from PSlibrary for all elements [9]. Because the Nd 4</w:t>
+        <w:t xml:space="preserve">; Fig. SX) was calculated with the same procedure as for Fig. 3h, but with PAW datasets from PSlibrary for all elements [9]. Because the Nd 4</w:t>
       </w:r>
       <w:r>
         <w:rPr>
@@ -1240,17 +1260,17 @@
         <w:t xml:space="preserve">f</w:t>
       </w:r>
       <w:r>
-        <w:t xml:space="preserve"> electrons are frozen in the core of the Nd dataset, the calculations were non-spin-polarized and no Hubbard </w:t>
-      </w:r>
-      <w:r>
-        <w:rPr>
-          <w:i/>
-          <w:iCs/>
-        </w:rPr>
-        <w:t xml:space="preserve">U</w:t>
-      </w:r>
-      <w:r>
-        <w:t xml:space="preserve"> correction was applied.</w:t>
+        <w:t xml:space="preserve"> electrons are frozen in the core, the calculated gap does not include the localized Nd 4</w:t>
+      </w:r>
+      <w:r>
+        <w:rPr>
+          <w:i/>
+          <w:iCs/>
+        </w:rPr>
+        <w:t xml:space="preserve">f</w:t>
+      </w:r>
+      <w:r>
+        <w:t xml:space="preserve"> states.</w:t>
       </w:r>
     </w:p>
     <w:p>
@@ -1509,6 +1529,24 @@
       </w:pPr>
       <w:r>
         <w:t xml:space="preserve">[14]</w:t>
+      </w:r>
+      <w:r>
+        <w:tab/>
+      </w:r>
+      <w:r>
+        <w:t xml:space="preserve">A. Wang, R. Kingsbury, M. McDermott, M. Horton, A. Jain, S. P. Ong, S. Dwaraknath, K. A. Persson, A framework for quantifying uncertainty in DFT energy corrections, Sci. Rep. 11 (2021) 15496. https://doi.org/10.1038/s41598-021-94550-5.</w:t>
+      </w:r>
+    </w:p>
+    <w:p>
+      <w:pPr>
+        <w:tabs>
+          <w:tab w:val="left" w:pos="560"/>
+        </w:tabs>
+        <w:spacing w:after="0" w:line="480" w:lineRule="auto"/>
+        <w:ind w:left="560" w:hanging="560"/>
+      </w:pPr>
+      <w:r>
+        <w:t xml:space="preserve">[15]</w:t>
       </w:r>
       <w:r>
         <w:tab/>

</xml_diff>